<commit_message>
Lab 2: web UI ticket generator
</commit_message>
<xml_diff>
--- a/tickets.docx
+++ b/tickets.docx
@@ -9,17 +9,17 @@
     </w:p>
     <w:p>
       <w:r>
-        <w:t>1. Определение алгоритма и его свойства</w:t>
+        <w:t>1. Что такое алгоритм и каковы его свойства?</w:t>
       </w:r>
     </w:p>
     <w:p>
       <w:r>
-        <w:t>2. Сложность алгоритмов: O-нотация</w:t>
+        <w:t>2. Чем стек отличается от очереди?</w:t>
       </w:r>
     </w:p>
     <w:p>
       <w:r>
-        <w:t>3. Структуры данных: список, стек, очередь</w:t>
+        <w:t>3. Что такое рекурсия? Приведите пример.</w:t>
       </w:r>
     </w:p>
     <w:p/>
@@ -30,17 +30,17 @@
     </w:p>
     <w:p>
       <w:r>
-        <w:t>1. Реляционная модель данных</w:t>
+        <w:t>1. Что описывает асимптотическая сложность?</w:t>
       </w:r>
     </w:p>
     <w:p>
       <w:r>
-        <w:t>2. Нормальные формы (1НФ-3НФ)</w:t>
+        <w:t>2. Как работает бинарный поиск?</w:t>
       </w:r>
     </w:p>
     <w:p>
       <w:r>
-        <w:t>3. SQL: SELECT, JOIN, GROUP BY</w:t>
+        <w:t>3. Для чего нужна хеш-таблица?</w:t>
       </w:r>
     </w:p>
     <w:p/>
@@ -51,17 +51,17 @@
     </w:p>
     <w:p>
       <w:r>
-        <w:t>1. Объектно-ориентированное программирование: инкапсуляция</w:t>
+        <w:t>1. В чём разница между процессом и потоком?</w:t>
       </w:r>
     </w:p>
     <w:p>
       <w:r>
-        <w:t>2. Наследование и полиморфизм</w:t>
+        <w:t>2. Что такое взаимная блокировка (deadlock)?</w:t>
       </w:r>
     </w:p>
     <w:p>
       <w:r>
-        <w:t>3. Паттерны проектирования: Singleton, Factory</w:t>
+        <w:t>3. Зачем нужен планировщик ОС?</w:t>
       </w:r>
     </w:p>
     <w:p/>
@@ -72,33 +72,12 @@
     </w:p>
     <w:p>
       <w:r>
-        <w:t>1. Сети: модель OSI</w:t>
+        <w:t>1. Этот билет намеренно битый — только два вопроса.</w:t>
       </w:r>
     </w:p>
     <w:p>
       <w:r>
-        <w:t>2. TCP vs UDP</w:t>
-      </w:r>
-    </w:p>
-    <w:p/>
-    <w:p>
-      <w:r>
-        <w:t>Билет 5</w:t>
-      </w:r>
-    </w:p>
-    <w:p>
-      <w:r>
-        <w:t>1. Операционные системы: процессы и потоки</w:t>
-      </w:r>
-    </w:p>
-    <w:p>
-      <w:r>
-        <w:t>2. Управление памятью</w:t>
-      </w:r>
-    </w:p>
-    <w:p>
-      <w:r>
-        <w:t>3. Файловые системы</w:t>
+        <w:t>2. Парсер должен его пропустить и продолжить работу.</w:t>
       </w:r>
     </w:p>
     <w:p/>

</xml_diff>